<commit_message>
Deploy preview for PR 111 🛫
</commit_message>
<xml_diff>
--- a/pr-preview/pr-111/chapters/20-treatment-confounder-feedback-tracked-changes.docx
+++ b/pr-preview/pr-111/chapters/20-treatment-confounder-feedback-tracked-changes.docx
@@ -122,7 +122,7 @@
       </w:ins>
       <w:ins w:id="1" w:author="PR Preview" w:date="2024-01-01T00:00:00Z">
         <w:r>
-          <w:t xml:space="preserve">or while sharing with earlier treatment a cause outside the measured past,</w:t>
+          <w:t xml:space="preserve">or while sharing with earlier treatment a cause outside that treatment’s measured past,</w:t>
         </w:r>
       </w:ins>
       <w:ins w:id="1" w:author="PR Preview" w:date="2024-01-01T00:00:00Z">
@@ -132,7 +132,7 @@
       </w:ins>
       <w:ins w:id="1" w:author="PR Preview" w:date="2024-01-01T00:00:00Z">
         <w:r>
-          <w:t xml:space="preserve">through a path that conditioning on the measured past does not block.</w:t>
+          <w:t xml:space="preserve">through a path that conditioning on that measured past does not block.</w:t>
         </w:r>
       </w:ins>
       <w:ins w:id="1" w:author="PR Preview" w:date="2024-01-01T00:00:00Z">
@@ -329,7 +329,7 @@
       </w:ins>
       <w:ins w:id="3" w:author="PR Preview" w:date="2024-01-01T00:00:00Z">
         <w:r>
-          <w:t xml:space="preserve">a cause outside the measured past</w:t>
+          <w:t xml:space="preserve">a cause outside the measured past of</w:t>
         </w:r>
       </w:ins>
       <w:ins w:id="3" w:author="PR Preview" w:date="2024-01-01T00:00:00Z">
@@ -337,9 +337,28 @@
           <w:t xml:space="preserve"> </w:t>
         </w:r>
       </w:ins>
+      <m:oMath>
+        <m:sSub>
+          <m:e>
+            <m:r>
+              <m:t>A</m:t>
+            </m:r>
+          </m:e>
+          <m:sub>
+            <m:r>
+              <m:t>0</m:t>
+            </m:r>
+          </m:sub>
+        </m:sSub>
+      </m:oMath>
       <w:ins w:id="3" w:author="PR Preview" w:date="2024-01-01T00:00:00Z">
         <w:r>
-          <w:t xml:space="preserve">through a path that conditioning on the measured past does not block,</w:t>
+          <w:t xml:space="preserve"> </w:t>
+        </w:r>
+      </w:ins>
+      <w:ins w:id="3" w:author="PR Preview" w:date="2024-01-01T00:00:00Z">
+        <w:r>
+          <w:t xml:space="preserve">through a path that conditioning on that measured past does not block,</w:t>
         </w:r>
       </w:ins>
       <w:ins w:id="3" w:author="PR Preview" w:date="2024-01-01T00:00:00Z">
@@ -679,7 +698,27 @@
               <w:t xml:space="preserve"> </w:t>
             </w:r>
             <w:r>
-              <w:t xml:space="preserve">Write</w:t>
+              <w:t xml:space="preserve">For</w:t>
+            </w:r>
+            <w:r>
+              <w:t xml:space="preserve"> </w:t>
+            </w:r>
+            <m:oMath>
+              <m:r>
+                <m:t>j</m:t>
+              </m:r>
+              <m:r>
+                <m:rPr>
+                  <m:sty m:val="p"/>
+                </m:rPr>
+                <m:t>≥</m:t>
+              </m:r>
+              <m:r>
+                <m:t>0</m:t>
+              </m:r>
+            </m:oMath>
+            <w:r>
+              <w:t xml:space="preserve">, write</w:t>
             </w:r>
             <w:r>
               <w:t xml:space="preserve"> </w:t>
@@ -706,16 +745,7 @@
                 </m:e>
                 <m:sub>
                   <m:r>
-                    <m:t>k</m:t>
-                  </m:r>
-                  <m:r>
-                    <m:rPr>
-                      <m:sty m:val="p"/>
-                    </m:rPr>
-                    <m:t>−</m:t>
-                  </m:r>
-                  <m:r>
-                    <m:t>1</m:t>
+                    <m:t>j</m:t>
                   </m:r>
                 </m:sub>
               </m:sSub>
@@ -740,7 +770,7 @@
                 </m:e>
                 <m:sub>
                   <m:r>
-                    <m:t>k</m:t>
+                    <m:t>j</m:t>
                   </m:r>
                   <m:r>
                     <m:rPr>
@@ -749,7 +779,7 @@
                     <m:t>−</m:t>
                   </m:r>
                   <m:r>
-                    <m:t>2</m:t>
+                    <m:t>1</m:t>
                   </m:r>
                 </m:sub>
               </m:sSub>
@@ -778,16 +808,7 @@
                 </m:e>
                 <m:sub>
                   <m:r>
-                    <m:t>k</m:t>
-                  </m:r>
-                  <m:r>
-                    <m:rPr>
-                      <m:sty m:val="p"/>
-                    </m:rPr>
-                    <m:t>−</m:t>
-                  </m:r>
-                  <m:r>
-                    <m:t>1</m:t>
+                    <m:t>j</m:t>
                   </m:r>
                 </m:sub>
               </m:sSub>
@@ -889,10 +910,50 @@
               <w:t xml:space="preserve">and</w:t>
             </w:r>
             <w:r>
-              <w:t xml:space="preserve"> </w:t>
-            </w:r>
-            <w:r>
-              <w:t xml:space="preserve">either</w:t>
+              <w:t xml:space="preserve">, for some earlier treatment</w:t>
+            </w:r>
+            <w:r>
+              <w:t xml:space="preserve"> </w:t>
+            </w:r>
+            <m:oMath>
+              <m:sSub>
+                <m:e>
+                  <m:r>
+                    <m:t>A</m:t>
+                  </m:r>
+                </m:e>
+                <m:sub>
+                  <m:r>
+                    <m:t>j</m:t>
+                  </m:r>
+                </m:sub>
+              </m:sSub>
+            </m:oMath>
+            <w:r>
+              <w:t xml:space="preserve"> </w:t>
+            </w:r>
+            <w:r>
+              <w:t xml:space="preserve">with</w:t>
+            </w:r>
+            <w:r>
+              <w:t xml:space="preserve"> </w:t>
+            </w:r>
+            <m:oMath>
+              <m:r>
+                <m:t>j</m:t>
+              </m:r>
+              <m:r>
+                <m:rPr>
+                  <m:sty m:val="p"/>
+                </m:rPr>
+                <m:t>&lt;</m:t>
+              </m:r>
+              <m:r>
+                <m:t>k</m:t>
+              </m:r>
+            </m:oMath>
+            <w:r>
+              <w:t xml:space="preserve">, either</w:t>
             </w:r>
           </w:p>
           <w:p>
@@ -921,7 +982,7 @@
               <w:t xml:space="preserve"> </w:t>
             </w:r>
             <w:r>
-              <w:t xml:space="preserve">is affected by earlier treatment</w:t>
+              <w:t xml:space="preserve">is affected by</w:t>
             </w:r>
             <w:r>
               <w:t xml:space="preserve"> </w:t>
@@ -935,16 +996,7 @@
                 </m:e>
                 <m:sub>
                   <m:r>
-                    <m:t>k</m:t>
-                  </m:r>
-                  <m:r>
-                    <m:rPr>
-                      <m:sty m:val="p"/>
-                    </m:rPr>
-                    <m:t>−</m:t>
-                  </m:r>
-                  <m:r>
-                    <m:t>1</m:t>
+                    <m:t>j</m:t>
                   </m:r>
                 </m:sub>
               </m:sSub>
@@ -993,16 +1045,7 @@
                 </m:e>
                 <m:sub>
                   <m:r>
-                    <m:t>k</m:t>
-                  </m:r>
-                  <m:r>
-                    <m:rPr>
-                      <m:sty m:val="p"/>
-                    </m:rPr>
-                    <m:t>−</m:t>
-                  </m:r>
-                  <m:r>
-                    <m:t>1</m:t>
+                    <m:t>j</m:t>
                   </m:r>
                 </m:sub>
               </m:sSub>
@@ -1011,13 +1054,7 @@
               <w:t xml:space="preserve"> </w:t>
             </w:r>
             <w:r>
-              <w:t xml:space="preserve">share a common cause outside the measured past,</w:t>
-            </w:r>
-            <w:r>
-              <w:t xml:space="preserve"> </w:t>
-            </w:r>
-            <w:r>
-              <w:t xml:space="preserve">through a path between them (such as</w:t>
+              <w:t xml:space="preserve">share a common cause outside the measured past of</w:t>
             </w:r>
             <w:r>
               <w:t xml:space="preserve"> </w:t>
@@ -1031,46 +1068,63 @@
                 </m:e>
                 <m:sub>
                   <m:r>
-                    <m:t>k</m:t>
-                  </m:r>
-                  <m:r>
-                    <m:rPr>
-                      <m:sty m:val="p"/>
-                    </m:rPr>
-                    <m:t>−</m:t>
-                  </m:r>
-                  <m:r>
-                    <m:t>1</m:t>
+                    <m:t>j</m:t>
                   </m:r>
                 </m:sub>
               </m:sSub>
-              <m:r>
-                <m:rPr>
-                  <m:sty m:val="p"/>
-                </m:rPr>
-                <m:t>←</m:t>
-              </m:r>
-              <m:r>
-                <m:t>W</m:t>
-              </m:r>
-              <m:r>
-                <m:rPr>
-                  <m:sty m:val="p"/>
-                </m:rPr>
-                <m:t>→</m:t>
-              </m:r>
+            </m:oMath>
+            <w:r>
+              <w:t xml:space="preserve">,</w:t>
+            </w:r>
+            <w:r>
+              <w:t xml:space="preserve"> </w:t>
+            </w:r>
+            <w:r>
+              <w:t xml:space="preserve">through a path between them (such as</w:t>
+            </w:r>
+            <w:r>
+              <w:t xml:space="preserve"> </w:t>
+            </w:r>
+            <m:oMath>
               <m:sSub>
                 <m:e>
                   <m:r>
-                    <m:t>L</m:t>
+                    <m:t>A</m:t>
                   </m:r>
                 </m:e>
                 <m:sub>
                   <m:r>
-                    <m:t>k</m:t>
+                    <m:t>j</m:t>
                   </m:r>
                 </m:sub>
               </m:sSub>
+              <m:r>
+                <m:rPr>
+                  <m:sty m:val="p"/>
+                </m:rPr>
+                <m:t>←</m:t>
+              </m:r>
+              <m:r>
+                <m:t>W</m:t>
+              </m:r>
+              <m:r>
+                <m:rPr>
+                  <m:sty m:val="p"/>
+                </m:rPr>
+                <m:t>→</m:t>
+              </m:r>
+              <m:sSub>
+                <m:e>
+                  <m:r>
+                    <m:t>L</m:t>
+                  </m:r>
+                </m:e>
+                <m:sub>
+                  <m:r>
+                    <m:t>k</m:t>
+                  </m:r>
+                </m:sub>
+              </m:sSub>
             </m:oMath>
             <w:r>
               <w:t xml:space="preserve"> </w:t>
@@ -1096,7 +1150,7 @@
               <w:t xml:space="preserve"> </w:t>
             </w:r>
             <w:r>
-              <w:t xml:space="preserve">that conditioning on the measured past does not block.</w:t>
+              <w:t xml:space="preserve">that conditioning on that measured past does not block.</w:t>
             </w:r>
           </w:p>
           <w:bookmarkEnd w:id="9"/>
@@ -1109,7 +1163,12 @@
       </w:pPr>
       <w:ins w:id="6" w:author="PR Preview" w:date="2024-01-01T00:00:00Z">
         <w:r>
-          <w:t xml:space="preserve">The book’s one-line description is the arrow form (</w:t>
+          <w:t xml:space="preserve">The book’s one-line description is the effect form (a directed path</w:t>
+        </w:r>
+      </w:ins>
+      <w:ins w:id="6" w:author="PR Preview" w:date="2024-01-01T00:00:00Z">
+        <w:r>
+          <w:t xml:space="preserve"> </w:t>
         </w:r>
       </w:ins>
       <m:oMath>
@@ -1121,19 +1180,22 @@
           </m:e>
           <m:sub>
             <m:r>
-              <m:t>k</m:t>
-            </m:r>
-            <m:r>
-              <m:rPr>
-                <m:sty m:val="p"/>
-              </m:rPr>
-              <m:t>−</m:t>
-            </m:r>
-            <m:r>
-              <m:t>1</m:t>
+              <m:t>j</m:t>
             </m:r>
           </m:sub>
         </m:sSub>
+        <m:r>
+          <m:rPr>
+            <m:sty m:val="p"/>
+          </m:rPr>
+          <m:t>→</m:t>
+        </m:r>
+        <m:r>
+          <m:rPr>
+            <m:sty m:val="p"/>
+          </m:rPr>
+          <m:t>⋯</m:t>
+        </m:r>
         <m:r>
           <m:rPr>
             <m:sty m:val="p"/>
@@ -1155,6 +1217,35 @@
       </m:oMath>
       <w:ins w:id="6" w:author="PR Preview" w:date="2024-01-01T00:00:00Z">
         <w:r>
+          <w:t xml:space="preserve"> </w:t>
+        </w:r>
+      </w:ins>
+      <w:ins w:id="6" w:author="PR Preview" w:date="2024-01-01T00:00:00Z">
+        <w:r>
+          <w:t xml:space="preserve">for some</w:t>
+        </w:r>
+      </w:ins>
+      <w:ins w:id="6" w:author="PR Preview" w:date="2024-01-01T00:00:00Z">
+        <w:r>
+          <w:t xml:space="preserve"> </w:t>
+        </w:r>
+      </w:ins>
+      <m:oMath>
+        <m:r>
+          <m:t>j</m:t>
+        </m:r>
+        <m:r>
+          <m:rPr>
+            <m:sty m:val="p"/>
+          </m:rPr>
+          <m:t>&lt;</m:t>
+        </m:r>
+        <m:r>
+          <m:t>k</m:t>
+        </m:r>
+      </m:oMath>
+      <w:ins w:id="6" w:author="PR Preview" w:date="2024-01-01T00:00:00Z">
+        <w:r>
           <w:t xml:space="preserve">):</w:t>
         </w:r>
       </w:ins>
@@ -1316,7 +1407,7 @@
       </w:ins>
       <w:ins w:id="6" w:author="PR Preview" w:date="2024-01-01T00:00:00Z">
         <w:r>
-          <w:t xml:space="preserve">produces the same bias in that case as in the arrow form;</w:t>
+          <w:t xml:space="preserve">produces the same bias in that case as in the effect form;</w:t>
         </w:r>
       </w:ins>
       <w:ins w:id="6" w:author="PR Preview" w:date="2024-01-01T00:00:00Z">
@@ -1999,7 +2090,35 @@
               <w:t xml:space="preserve"> </w:t>
             </w:r>
             <w:r>
-              <w:t xml:space="preserve">In the book’s Figure 20.2, the arrows from</w:t>
+              <w:t xml:space="preserve">In the book’s Figure 20.2, the arrows from treatment to later</w:t>
+            </w:r>
+            <w:r>
+              <w:t xml:space="preserve"> </w:t>
+            </w:r>
+            <m:oMath>
+              <m:r>
+                <m:t>L</m:t>
+              </m:r>
+            </m:oMath>
+            <w:r>
+              <w:t xml:space="preserve"> </w:t>
+            </w:r>
+            <w:r>
+              <w:t xml:space="preserve">and</w:t>
+            </w:r>
+            <w:r>
+              <w:t xml:space="preserve"> </w:t>
+            </w:r>
+            <m:oMath>
+              <m:r>
+                <m:t>U</m:t>
+              </m:r>
+            </m:oMath>
+            <w:r>
+              <w:t xml:space="preserve"> </w:t>
+            </w:r>
+            <w:r>
+              <w:t xml:space="preserve">variables are deleted:</w:t>
             </w:r>
             <w:r>
               <w:t xml:space="preserve"> </w:t>
@@ -2008,21 +2127,12 @@
               <m:sSub>
                 <m:e>
                   <m:r>
-                    <m:t>A</m:t>
+                    <m:t>L</m:t>
                   </m:r>
                 </m:e>
                 <m:sub>
                   <m:r>
                     <m:t>k</m:t>
-                  </m:r>
-                  <m:r>
-                    <m:rPr>
-                      <m:sty m:val="p"/>
-                    </m:rPr>
-                    <m:t>−</m:t>
-                  </m:r>
-                  <m:r>
-                    <m:t>1</m:t>
                   </m:r>
                 </m:sub>
               </m:sSub>
@@ -2031,7 +2141,7 @@
               <w:t xml:space="preserve"> </w:t>
             </w:r>
             <w:r>
-              <w:t xml:space="preserve">to</w:t>
+              <w:t xml:space="preserve">still confounds the effect of</w:t>
             </w:r>
             <w:r>
               <w:t xml:space="preserve"> </w:t>
@@ -2040,7 +2150,7 @@
               <m:sSub>
                 <m:e>
                   <m:r>
-                    <m:t>L</m:t>
+                    <m:t>A</m:t>
                   </m:r>
                 </m:e>
                 <m:sub>
@@ -2051,10 +2161,13 @@
               </m:sSub>
             </m:oMath>
             <w:r>
-              <w:t xml:space="preserve"> </w:t>
-            </w:r>
-            <w:r>
-              <w:t xml:space="preserve">and to</w:t>
+              <w:t xml:space="preserve">,</w:t>
+            </w:r>
+            <w:r>
+              <w:t xml:space="preserve"> </w:t>
+            </w:r>
+            <w:r>
+              <w:t xml:space="preserve">but no earlier treatment</w:t>
             </w:r>
             <w:r>
               <w:t xml:space="preserve"> </w:t>
@@ -2063,12 +2176,12 @@
               <m:sSub>
                 <m:e>
                   <m:r>
-                    <m:t>U</m:t>
+                    <m:t>A</m:t>
                   </m:r>
                 </m:e>
                 <m:sub>
                   <m:r>
-                    <m:t>k</m:t>
+                    <m:t>j</m:t>
                   </m:r>
                 </m:sub>
               </m:sSub>
@@ -2077,7 +2190,30 @@
               <w:t xml:space="preserve"> </w:t>
             </w:r>
             <w:r>
-              <w:t xml:space="preserve">are deleted:</w:t>
+              <w:t xml:space="preserve">(</w:t>
+            </w:r>
+            <m:oMath>
+              <m:r>
+                <m:t>j</m:t>
+              </m:r>
+              <m:r>
+                <m:rPr>
+                  <m:sty m:val="p"/>
+                </m:rPr>
+                <m:t>&lt;</m:t>
+              </m:r>
+              <m:r>
+                <m:t>k</m:t>
+              </m:r>
+            </m:oMath>
+            <w:r>
+              <w:t xml:space="preserve">) affects it.</w:t>
+            </w:r>
+            <w:r>
+              <w:t xml:space="preserve"> </w:t>
+            </w:r>
+            <w:r>
+              <w:t xml:space="preserve">Nor does</w:t>
             </w:r>
             <w:r>
               <w:t xml:space="preserve"> </w:t>
@@ -2100,7 +2236,7 @@
               <w:t xml:space="preserve"> </w:t>
             </w:r>
             <w:r>
-              <w:t xml:space="preserve">still confounds the effect of</w:t>
+              <w:t xml:space="preserve">share with any earlier</w:t>
             </w:r>
             <w:r>
               <w:t xml:space="preserve"> </w:t>
@@ -2114,25 +2250,16 @@
                 </m:e>
                 <m:sub>
                   <m:r>
-                    <m:t>k</m:t>
+                    <m:t>j</m:t>
                   </m:r>
                 </m:sub>
               </m:sSub>
             </m:oMath>
             <w:r>
-              <w:t xml:space="preserve">,</w:t>
-            </w:r>
-            <w:r>
-              <w:t xml:space="preserve"> </w:t>
-            </w:r>
-            <w:r>
-              <w:t xml:space="preserve">but it is not affected by prior treatment.</w:t>
-            </w:r>
-            <w:r>
-              <w:t xml:space="preserve"> </w:t>
-            </w:r>
-            <w:r>
-              <w:t xml:space="preserve">Nor do</w:t>
+              <w:t xml:space="preserve"> </w:t>
+            </w:r>
+            <w:r>
+              <w:t xml:space="preserve">a common cause outside the measured past of</w:t>
             </w:r>
             <w:r>
               <w:t xml:space="preserve"> </w:t>
@@ -2141,12 +2268,12 @@
               <m:sSub>
                 <m:e>
                   <m:r>
-                    <m:t>L</m:t>
+                    <m:t>A</m:t>
                   </m:r>
                 </m:e>
                 <m:sub>
                   <m:r>
-                    <m:t>k</m:t>
+                    <m:t>j</m:t>
                   </m:r>
                 </m:sub>
               </m:sSub>
@@ -2155,39 +2282,7 @@
               <w:t xml:space="preserve"> </w:t>
             </w:r>
             <w:r>
-              <w:t xml:space="preserve">and</w:t>
-            </w:r>
-            <w:r>
-              <w:t xml:space="preserve"> </w:t>
-            </w:r>
-            <m:oMath>
-              <m:sSub>
-                <m:e>
-                  <m:r>
-                    <m:t>A</m:t>
-                  </m:r>
-                </m:e>
-                <m:sub>
-                  <m:r>
-                    <m:t>k</m:t>
-                  </m:r>
-                  <m:r>
-                    <m:rPr>
-                      <m:sty m:val="p"/>
-                    </m:rPr>
-                    <m:t>−</m:t>
-                  </m:r>
-                  <m:r>
-                    <m:t>1</m:t>
-                  </m:r>
-                </m:sub>
-              </m:sSub>
-            </m:oMath>
-            <w:r>
-              <w:t xml:space="preserve"> </w:t>
-            </w:r>
-            <w:r>
-              <w:t xml:space="preserve">share a common cause outside the measured past in the sense of</w:t>
+              <w:t xml:space="preserve">in the sense of</w:t>
             </w:r>
             <w:r>
               <w:t xml:space="preserve"> </w:t>
@@ -2241,16 +2336,7 @@
                 </m:e>
                 <m:sub>
                   <m:r>
-                    <m:t>k</m:t>
-                  </m:r>
-                  <m:r>
-                    <m:rPr>
-                      <m:sty m:val="p"/>
-                    </m:rPr>
-                    <m:t>−</m:t>
-                  </m:r>
-                  <m:r>
-                    <m:t>1</m:t>
+                    <m:t>j</m:t>
                   </m:r>
                 </m:sub>
               </m:sSub>
@@ -2280,16 +2366,7 @@
                 </m:e>
                 <m:sub>
                   <m:r>
-                    <m:t>k</m:t>
-                  </m:r>
-                  <m:r>
-                    <m:rPr>
-                      <m:sty m:val="p"/>
-                    </m:rPr>
-                    <m:t>−</m:t>
-                  </m:r>
-                  <m:r>
-                    <m:t>1</m:t>
+                    <m:t>j</m:t>
                   </m:r>
                 </m:sub>
               </m:sSub>
@@ -4170,7 +4247,13 @@
               <w:t xml:space="preserve"> </w:t>
             </w:r>
             <w:r>
-              <w:t xml:space="preserve">traditional methods (stratification, outcome regression, matching)</w:t>
+              <w:t xml:space="preserve">traditional methods (stratification, matching,</w:t>
+            </w:r>
+            <w:r>
+              <w:t xml:space="preserve"> </w:t>
+            </w:r>
+            <w:r>
+              <w:t xml:space="preserve">and outcome regression whose treatment coefficients are read as the effect)</w:t>
             </w:r>
             <w:r>
               <w:t xml:space="preserve"> </w:t>
@@ -6077,19 +6160,145 @@
               <w:t xml:space="preserve"> </w:t>
             </w:r>
             <w:r>
-              <w:t xml:space="preserve">the trial is an ideal one, with full adherence and no loss to follow-up,</w:t>
-            </w:r>
-            <w:r>
-              <w:t xml:space="preserve"> </w:t>
-            </w:r>
-            <w:r>
-              <w:t xml:space="preserve">so each person’s recorded treatment is the treatment the protocol assigned,</w:t>
-            </w:r>
-            <w:r>
-              <w:t xml:space="preserve"> </w:t>
-            </w:r>
-            <w:r>
-              <w:t xml:space="preserve">and each person’s observed outcome is their counterfactual outcome under that treatment.</w:t>
+              <w:t xml:space="preserve">each treatment history</w:t>
+            </w:r>
+            <w:r>
+              <w:t xml:space="preserve"> </w:t>
+            </w:r>
+            <m:oMath>
+              <m:acc>
+                <m:accPr>
+                  <m:chr m:val="‾"/>
+                </m:accPr>
+                <m:e>
+                  <m:r>
+                    <m:t>a</m:t>
+                  </m:r>
+                </m:e>
+              </m:acc>
+              <m:r>
+                <m:rPr>
+                  <m:sty m:val="p"/>
+                </m:rPr>
+                <m:t>=</m:t>
+              </m:r>
+              <m:r>
+                <m:rPr>
+                  <m:sty m:val="p"/>
+                </m:rPr>
+                <m:t>(</m:t>
+              </m:r>
+              <m:sSub>
+                <m:e>
+                  <m:r>
+                    <m:t>a</m:t>
+                  </m:r>
+                </m:e>
+                <m:sub>
+                  <m:r>
+                    <m:t>0</m:t>
+                  </m:r>
+                </m:sub>
+              </m:sSub>
+              <m:r>
+                <m:rPr>
+                  <m:sty m:val="p"/>
+                </m:rPr>
+                <m:t>,</m:t>
+              </m:r>
+              <m:sSub>
+                <m:e>
+                  <m:r>
+                    <m:t>a</m:t>
+                  </m:r>
+                </m:e>
+                <m:sub>
+                  <m:r>
+                    <m:t>1</m:t>
+                  </m:r>
+                </m:sub>
+              </m:sSub>
+              <m:r>
+                <m:rPr>
+                  <m:sty m:val="p"/>
+                </m:rPr>
+                <m:t>)</m:t>
+              </m:r>
+            </m:oMath>
+            <w:r>
+              <w:t xml:space="preserve"> </w:t>
+            </w:r>
+            <w:r>
+              <w:t xml:space="preserve">is a well-defined intervention,</w:t>
+            </w:r>
+            <w:r>
+              <w:t xml:space="preserve"> </w:t>
+            </w:r>
+            <w:r>
+              <w:t xml:space="preserve">and a person whose observed history is</w:t>
+            </w:r>
+            <w:r>
+              <w:t xml:space="preserve"> </w:t>
+            </w:r>
+            <m:oMath>
+              <m:acc>
+                <m:accPr>
+                  <m:chr m:val="‾"/>
+                </m:accPr>
+                <m:e>
+                  <m:r>
+                    <m:t>a</m:t>
+                  </m:r>
+                </m:e>
+              </m:acc>
+            </m:oMath>
+            <w:r>
+              <w:t xml:space="preserve"> </w:t>
+            </w:r>
+            <w:r>
+              <w:t xml:space="preserve">has observed outcome</w:t>
+            </w:r>
+            <w:r>
+              <w:t xml:space="preserve"> </w:t>
+            </w:r>
+            <m:oMath>
+              <m:r>
+                <m:t>Y</m:t>
+              </m:r>
+              <m:r>
+                <m:rPr>
+                  <m:sty m:val="p"/>
+                </m:rPr>
+                <m:t>=</m:t>
+              </m:r>
+              <m:sSup>
+                <m:e>
+                  <m:r>
+                    <m:t>Y</m:t>
+                  </m:r>
+                </m:e>
+                <m:sup>
+                  <m:acc>
+                    <m:accPr>
+                      <m:chr m:val="‾"/>
+                    </m:accPr>
+                    <m:e>
+                      <m:r>
+                        <m:t>a</m:t>
+                      </m:r>
+                    </m:e>
+                  </m:acc>
+                </m:sup>
+              </m:sSup>
+            </m:oMath>
+            <w:r>
+              <w:t xml:space="preserve">;</w:t>
+            </w:r>
+            <w:r>
+              <w:t xml:space="preserve"> </w:t>
+            </w:r>
+            <w:r>
+              <w:t xml:space="preserve">in this ideal trial the recorded history is the treatment actually received.</w:t>
             </w:r>
           </w:p>
           <w:p>
@@ -15615,7 +15824,7 @@
               <w:t xml:space="preserve"> </w:t>
             </w:r>
             <w:r>
-              <w:t xml:space="preserve">Regression Does Not Remove the Bias</w:t>
+              <w:t xml:space="preserve">Conventional Outcome Regression Does Not Remove the Bias</w:t>
             </w:r>
           </w:p>
         </w:tc>
@@ -15639,13 +15848,25 @@
               <w:spacing w:before="16" w:after="16"/>
             </w:pPr>
             <w:r>
-              <w:t xml:space="preserve">Paying the price of a dose-response model buys no protection:</w:t>
-            </w:r>
-            <w:r>
-              <w:t xml:space="preserve"> </w:t>
-            </w:r>
-            <w:r>
-              <w:t xml:space="preserve">regression</w:t>
+              <w:t xml:space="preserve">Paying the price of a dose-response model buys no protection</w:t>
+            </w:r>
+            <w:r>
+              <w:t xml:space="preserve"> </w:t>
+            </w:r>
+            <w:r>
+              <w:t xml:space="preserve">if we read the treatment coefficients of an outcome regression as the effect</w:t>
+            </w:r>
+            <w:r>
+              <w:t xml:space="preserve"> </w:t>
+            </w:r>
+            <w:r>
+              <w:t xml:space="preserve">while the model conditions on the time-varying confounder.</w:t>
+            </w:r>
+            <w:r>
+              <w:t xml:space="preserve"> </w:t>
+            </w:r>
+            <w:r>
+              <w:t xml:space="preserve">That conventional use of regression</w:t>
             </w:r>
             <w:r>
               <w:t xml:space="preserve"> </w:t>
@@ -15661,7 +15882,7 @@
               <w:t xml:space="preserve"> </w:t>
             </w:r>
             <w:r>
-              <w:t xml:space="preserve">a conventional stratification-based method,</w:t>
+              <w:t xml:space="preserve">a stratification-based method,</w:t>
             </w:r>
             <w:r>
               <w:t xml:space="preserve"> </w:t>
@@ -15679,6 +15900,99 @@
             </w:hyperlink>
             <w:r>
               <w:t xml:space="preserve">).</w:t>
+            </w:r>
+            <w:r>
+              <w:t xml:space="preserve"> </w:t>
+            </w:r>
+            <w:r>
+              <w:t xml:space="preserve">The g-formula (Chapter 21) can fit the same kind of outcome model,</w:t>
+            </w:r>
+            <w:r>
+              <w:t xml:space="preserve"> </w:t>
+            </w:r>
+            <w:r>
+              <w:t xml:space="preserve">but it averages the model’s predictions over the distribution of each time-varying confounder</w:t>
+            </w:r>
+            <w:r>
+              <w:t xml:space="preserve"> </w:t>
+            </w:r>
+            <w:r>
+              <w:t xml:space="preserve">given past treatment and past confounders</w:t>
+            </w:r>
+            <w:r>
+              <w:t xml:space="preserve"> </w:t>
+            </w:r>
+            <w:r>
+              <w:t xml:space="preserve">(in this chapter’s two-time-point example, which has no</w:t>
+            </w:r>
+            <w:r>
+              <w:t xml:space="preserve"> </w:t>
+            </w:r>
+            <m:oMath>
+              <m:sSub>
+                <m:e>
+                  <m:r>
+                    <m:t>L</m:t>
+                  </m:r>
+                </m:e>
+                <m:sub>
+                  <m:r>
+                    <m:t>0</m:t>
+                  </m:r>
+                </m:sub>
+              </m:sSub>
+            </m:oMath>
+            <w:r>
+              <w:t xml:space="preserve">:</w:t>
+            </w:r>
+            <w:r>
+              <w:t xml:space="preserve"> </w:t>
+            </w:r>
+            <m:oMath>
+              <m:sSub>
+                <m:e>
+                  <m:r>
+                    <m:t>L</m:t>
+                  </m:r>
+                </m:e>
+                <m:sub>
+                  <m:r>
+                    <m:t>1</m:t>
+                  </m:r>
+                </m:sub>
+              </m:sSub>
+            </m:oMath>
+            <w:r>
+              <w:t xml:space="preserve"> </w:t>
+            </w:r>
+            <w:r>
+              <w:t xml:space="preserve">given</w:t>
+            </w:r>
+            <w:r>
+              <w:t xml:space="preserve"> </w:t>
+            </w:r>
+            <m:oMath>
+              <m:sSub>
+                <m:e>
+                  <m:r>
+                    <m:t>A</m:t>
+                  </m:r>
+                </m:e>
+                <m:sub>
+                  <m:r>
+                    <m:t>0</m:t>
+                  </m:r>
+                </m:sub>
+              </m:sSub>
+            </m:oMath>
+            <w:r>
+              <w:t xml:space="preserve">)</w:t>
+            </w:r>
+            <w:r>
+              <w:t xml:space="preserve"> </w:t>
+            </w:r>
+            <w:r>
+              <w:t xml:space="preserve">instead of reading the effect off the coefficients.</w:t>
             </w:r>
           </w:p>
           <w:p/>
@@ -21211,7 +21525,7 @@
       </w:ins>
       <w:ins w:id="65" w:author="PR Preview" w:date="2024-01-01T00:00:00Z">
         <w:r>
-          <w:t xml:space="preserve">and either is affected by earlier treatment</w:t>
+          <w:t xml:space="preserve">and, for some earlier treatment</w:t>
         </w:r>
       </w:ins>
       <w:ins w:id="65" w:author="PR Preview" w:date="2024-01-01T00:00:00Z">
@@ -21228,16 +21542,7 @@
           </m:e>
           <m:sub>
             <m:r>
-              <m:t>k</m:t>
-            </m:r>
-            <m:r>
-              <m:rPr>
-                <m:sty m:val="p"/>
-              </m:rPr>
-              <m:t>−</m:t>
-            </m:r>
-            <m:r>
-              <m:t>1</m:t>
+              <m:t>j</m:t>
             </m:r>
           </m:sub>
         </m:sSub>
@@ -21249,7 +21554,26 @@
       </w:ins>
       <w:ins w:id="65" w:author="PR Preview" w:date="2024-01-01T00:00:00Z">
         <w:r>
-          <w:t xml:space="preserve">or shares with</w:t>
+          <w:t xml:space="preserve">(</w:t>
+        </w:r>
+      </w:ins>
+      <m:oMath>
+        <m:r>
+          <m:t>j</m:t>
+        </m:r>
+        <m:r>
+          <m:rPr>
+            <m:sty m:val="p"/>
+          </m:rPr>
+          <m:t>&lt;</m:t>
+        </m:r>
+        <m:r>
+          <m:t>k</m:t>
+        </m:r>
+      </m:oMath>
+      <w:ins w:id="65" w:author="PR Preview" w:date="2024-01-01T00:00:00Z">
+        <w:r>
+          <w:t xml:space="preserve">), either is affected by</w:t>
         </w:r>
       </w:ins>
       <w:ins w:id="65" w:author="PR Preview" w:date="2024-01-01T00:00:00Z">
@@ -21266,16 +21590,7 @@
           </m:e>
           <m:sub>
             <m:r>
-              <m:t>k</m:t>
-            </m:r>
-            <m:r>
-              <m:rPr>
-                <m:sty m:val="p"/>
-              </m:rPr>
-              <m:t>−</m:t>
-            </m:r>
-            <m:r>
-              <m:t>1</m:t>
+              <m:t>j</m:t>
             </m:r>
           </m:sub>
         </m:sSub>
@@ -21287,7 +21602,7 @@
       </w:ins>
       <w:ins w:id="65" w:author="PR Preview" w:date="2024-01-01T00:00:00Z">
         <w:r>
-          <w:t xml:space="preserve">a cause outside the measured past,</w:t>
+          <w:t xml:space="preserve">or shares with</w:t>
         </w:r>
       </w:ins>
       <w:ins w:id="65" w:author="PR Preview" w:date="2024-01-01T00:00:00Z">
@@ -21295,9 +21610,62 @@
           <w:t xml:space="preserve"> </w:t>
         </w:r>
       </w:ins>
+      <m:oMath>
+        <m:sSub>
+          <m:e>
+            <m:r>
+              <m:t>A</m:t>
+            </m:r>
+          </m:e>
+          <m:sub>
+            <m:r>
+              <m:t>j</m:t>
+            </m:r>
+          </m:sub>
+        </m:sSub>
+      </m:oMath>
       <w:ins w:id="65" w:author="PR Preview" w:date="2024-01-01T00:00:00Z">
         <w:r>
-          <w:t xml:space="preserve">through a path that conditioning on the measured past does not block.</w:t>
+          <w:t xml:space="preserve"> </w:t>
+        </w:r>
+      </w:ins>
+      <w:ins w:id="65" w:author="PR Preview" w:date="2024-01-01T00:00:00Z">
+        <w:r>
+          <w:t xml:space="preserve">a cause outside the measured past of</w:t>
+        </w:r>
+      </w:ins>
+      <w:ins w:id="65" w:author="PR Preview" w:date="2024-01-01T00:00:00Z">
+        <w:r>
+          <w:t xml:space="preserve"> </w:t>
+        </w:r>
+      </w:ins>
+      <m:oMath>
+        <m:sSub>
+          <m:e>
+            <m:r>
+              <m:t>A</m:t>
+            </m:r>
+          </m:e>
+          <m:sub>
+            <m:r>
+              <m:t>j</m:t>
+            </m:r>
+          </m:sub>
+        </m:sSub>
+      </m:oMath>
+      <w:ins w:id="65" w:author="PR Preview" w:date="2024-01-01T00:00:00Z">
+        <w:r>
+          <w:t xml:space="preserve">,</w:t>
+        </w:r>
+      </w:ins>
+      <w:ins w:id="65" w:author="PR Preview" w:date="2024-01-01T00:00:00Z">
+        <w:r>
+          <w:t xml:space="preserve"> </w:t>
+        </w:r>
+      </w:ins>
+      <w:ins w:id="65" w:author="PR Preview" w:date="2024-01-01T00:00:00Z">
+        <w:r>
+          <w:t xml:space="preserve">through a path that conditioning on that measured past does not block.</w:t>
         </w:r>
       </w:ins>
     </w:p>
@@ -21616,15 +21984,55 @@
           <w:numId w:val="1012"/>
         </w:numPr>
       </w:pPr>
-      <w:r>
-        <w:t xml:space="preserve">Outcome regression and matching are stratification-based too,</w:t>
-      </w:r>
-      <w:r>
-        <w:t xml:space="preserve"> </w:t>
-      </w:r>
-      <w:r>
-        <w:t xml:space="preserve">so they are biased even when the regression model is correct.</w:t>
-      </w:r>
+      <w:ins w:id="68" w:author="PR Preview" w:date="2024-01-01T00:00:00Z">
+        <w:r>
+          <w:t xml:space="preserve">Conventional outcome regression (reading the effect off treatment coefficients in a model that conditions on</w:t>
+        </w:r>
+      </w:ins>
+      <w:ins w:id="68" w:author="PR Preview" w:date="2024-01-01T00:00:00Z">
+        <w:r>
+          <w:t xml:space="preserve"> </w:t>
+        </w:r>
+      </w:ins>
+      <m:oMath>
+        <m:sSub>
+          <m:e>
+            <m:r>
+              <m:t>L</m:t>
+            </m:r>
+          </m:e>
+          <m:sub>
+            <m:r>
+              <m:t>1</m:t>
+            </m:r>
+          </m:sub>
+        </m:sSub>
+      </m:oMath>
+      <w:ins w:id="68" w:author="PR Preview" w:date="2024-01-01T00:00:00Z">
+        <w:r>
+          <w:t xml:space="preserve">)</w:t>
+        </w:r>
+      </w:ins>
+      <w:ins w:id="68" w:author="PR Preview" w:date="2024-01-01T00:00:00Z">
+        <w:r>
+          <w:t xml:space="preserve"> </w:t>
+        </w:r>
+      </w:ins>
+      <w:ins w:id="68" w:author="PR Preview" w:date="2024-01-01T00:00:00Z">
+        <w:r>
+          <w:t xml:space="preserve">and matching are stratification-based too,</w:t>
+        </w:r>
+      </w:ins>
+      <w:ins w:id="68" w:author="PR Preview" w:date="2024-01-01T00:00:00Z">
+        <w:r>
+          <w:t xml:space="preserve"> </w:t>
+        </w:r>
+      </w:ins>
+      <w:ins w:id="68" w:author="PR Preview" w:date="2024-01-01T00:00:00Z">
+        <w:r>
+          <w:t xml:space="preserve">so they are biased even when the regression model is correct.</w:t>
+        </w:r>
+      </w:ins>
     </w:p>
     <w:p>
       <w:pPr>

</xml_diff>